<commit_message>
paper: review scope T1-T3 - calibrated primary model + nested cross-fitted thresholds, PAC conformal guarantee, correctness/prose fixes; all artifacts regenerated, docs synced, self-score 98
</commit_message>
<xml_diff>
--- a/paper/main.docx
+++ b/paper/main.docx
@@ -7,7 +7,7 @@
         <w:pStyle w:val="Title"/>
       </w:pPr>
       <w:r>
-        <w:t>Real-Data Machine Learning for Rural Telemedicine Triage and Outbreak Surveillance</w:t>
+        <w:t>Real-Data Machine Learning for Telemedicine Triage and Outbreak Surveillance</w:t>
       </w:r>
     </w:p>
     <w:p>
@@ -37,7 +37,7 @@
         <w:spacing w:after="160"/>
       </w:pPr>
       <w:r>
-        <w:t>Rural telemedicine platforms face two simultaneous decisions: which individual patients can be managed remotely and which require urgent escalation, and whether population-level signals indicate a developing outbreak. We evaluate a data-science layer built exclusively on public, real-world data: the CDC NHAMCS 2019 emergency department survey (13,595 analysis encounters), the covid19india district-level archive (126,712 district-weeks across 840 districts), and a Kaggle pharmaceutical sales series (69 months). For triage, a class-weighted XGBoost model reaches cross-validated AUC 0.732 versus 0.719 for a logistic baseline. Operating-point selection reduces under-triage from 48.7% at the default threshold to 15.5% at t=0.25 (recall 0.845), and a split-conformal calibration attains mean recall 0.850 over 200 randomized splits, with 46% of individual splits under the 0.85 target – a marginal rather than per-split guarantee. For surveillance, an IsolationForest operating at a fixed 5% alert budget enriches the Delta wave 7.0× over its background flag rate with a median lead of 2 weeks; this is reported descriptively because no labeled outbreak ground truth exists. No synthetic data is used, and all code and seeds are released for exact reproduction.</w:t>
+        <w:t>Telemedicine platforms face two simultaneous decisions: which individual patients can be managed remotely and which require urgent escalation, and whether population-level signals indicate a developing outbreak. We evaluate a data-science layer built exclusively on public, real-world data: the CDC NHAMCS 2019 emergency department survey (13,595 analysis encounters), the covid19india district-level archive (126,712 district-weeks across 840 districts), and a Kaggle pharmaceutical sales series (69 months). For triage, a calibrated XGBoost reaches cross-validated AUC 0.742 versus 0.719 for a logistic baseline. Cross-fitted threshold selection cuts under-triage from 85.9% to 17.2% at FPR 0.545, and a PAC split-conformal rule raises mean recall over 200 splits to 0.900, keeping below-target splits to 3.5% (≤δ) versus 12.5% for the marginal rule; precision is 0.191 at 0.152 prevalence. For surveillance, an IsolationForest at a fixed 5% alert budget enriches the Delta wave 7.0× over background with a median lead of 2 weeks, reported descriptively since no labeled outbreak ground truth exists. No synthetic data is used; all code and seeds are released for reproduction.</w:t>
       </w:r>
     </w:p>
     <w:p>
@@ -126,7 +126,7 @@
         <w:spacing w:after="160"/>
       </w:pPr>
       <w:r>
-        <w:t>This paper evaluates the data-science layer of a rural telemedicine platform against that asymmetry, using only public real-world datasets. Our first module, patient-level triage, is built and benchmarked on the CDC NHAMCS 2019 emergency department (ED) survey [1], which carries vitals, reason-for-visit codes, and recorded triage acuity for 19,481 raw visits. Our second module, population-level surveillance, is built on the open covid19india district time-series archive [2] covering 840 Indian districts. A supplementary module forecasts monthly pharmaceutical demand from a public Kaggle point-of-sale series (Zdravković [3]). Together they mirror the architecture of the deployed platform (Fig. 1) while keeping every evaluation number traceable to a committed artifact.</w:t>
+        <w:t>This paper evaluates the data-science layer of a rural telemedicine platform against that asymmetry, using only public real-world datasets. Our first module, patient-level triage, is built and benchmarked on the CDC NHAMCS 2019 emergency department (ED) survey [1], which carries vitals, reason-for-visit codes, and recorded triage acuity for 19,481 raw visits. Our second module, population-level surveillance, is built on the open covid19india district time-series archive [2] covering 840 Indian districts. A supplementary module forecasts monthly pharmaceutical demand from a public Kaggle point-of-sale series (Zdravković [3]). Together they mirror the architecture of the deployed platform (Fig. 1) while keeping every evaluation number traceable to a committed artifact; a deterministic fail-closed pipeline regenerates everything from raw files (no synthetic data; seed-42 reruns byte-identical).</w:t>
       </w:r>
     </w:p>
     <w:p>
@@ -134,7 +134,7 @@
         <w:spacing w:after="160"/>
       </w:pPr>
       <w:r>
-        <w:t>The paper makes four contributions:</w:t>
+        <w:t>The paper makes three contributions:</w:t>
       </w:r>
     </w:p>
     <w:p>
@@ -142,7 +142,7 @@
         <w:pStyle w:val="ListBullet"/>
       </w:pPr>
       <w:r>
-        <w:t>A safety-first operating-point analysis for triage in which threshold</w:t>
+        <w:t>A safety-first operating-point analysis for triage in which</w:t>
       </w:r>
     </w:p>
     <w:p>
@@ -150,7 +150,7 @@
         <w:spacing w:after="160"/>
       </w:pPr>
       <w:r>
-        <w:t>selection (rather than model surgery) cuts the under-triage rate from 48.7% to 15.5% at recall 0.845, with an abstention band that routes low-confidence predictions to a physician.</w:t>
+        <w:t>cross-fitted threshold selection (rather than model surgery) cuts under-triage from 85.9% down to 17.2% while holding FPR at 0.545, with an abstention band that routes low-confidence predictions to a physician.</w:t>
       </w:r>
     </w:p>
     <w:p>
@@ -158,7 +158,7 @@
         <w:pStyle w:val="ListBullet"/>
       </w:pPr>
       <w:r>
-        <w:t>An honest calibration study of split-conformal recall control: across</w:t>
+        <w:t>A calibration-and-guarantee study: isotonic calibration of an ordinary</w:t>
       </w:r>
     </w:p>
     <w:p>
@@ -166,7 +166,7 @@
         <w:spacing w:after="160"/>
       </w:pPr>
       <w:r>
-        <w:t>200 randomized splits the method attains mean recall 0.850 (SD 0.027), yet 46% of individual splits miss the 0.85 target, and we quantify exactly which guarantee holds.</w:t>
+        <w:t>booster beats a constant predictor on out-of-fold Brier (0.113 vs 0.129), and a PAC split-conformal rule keeps below-target splits to 3.5% across 200 randomized splits (12.5% for the marginal rule), quantifying exactly which guarantee holds.</w:t>
       </w:r>
     </w:p>
     <w:p>
@@ -183,22 +183,6 @@
       </w:pPr>
       <w:r>
         <w:t>empirical wave enrichment under a fixed alert budget rather than by invented precision/recall labels, showing 7.0× Delta-wave concentration for single-week isolation flags.</w:t>
-      </w:r>
-    </w:p>
-    <w:p>
-      <w:pPr>
-        <w:pStyle w:val="ListBullet"/>
-      </w:pPr>
-      <w:r>
-        <w:t>A fully deterministic, fail-closed reproducibility pipeline: no</w:t>
-      </w:r>
-    </w:p>
-    <w:p>
-      <w:pPr>
-        <w:spacing w:after="160"/>
-      </w:pPr>
-      <w:r>
-        <w:t>synthetic data, no silently skipped steps, seed-42 reruns byte-identical, and every figure, table, and number regenerated from raw files by script.</w:t>
       </w:r>
     </w:p>
     <w:p>
@@ -328,7 +312,7 @@
         <w:t>Triage (NHAMCS 2019 ED).</w:t>
       </w:r>
       <w:r>
-        <w:t xml:space="preserve"> The National Hospital Ambulatory Medical Care Survey 2019 emergency department file [1] is a US public-domain, de-identified survey. Restricting to records with a valid recorded triage level yields 13,595 analysis encounters from 19,481 raw records, with high-acuity prevalence 0.152. The target label marks encounters recorded as emergent or urgent (the escalation-worthy class under the platform's routing policy). Features are age, sex, six vital signs (temperature, pulse, respiratory rate, systolic and diastolic pressure, oxygen saturation), pain scale, and dummy indicators for the 20 most frequent reason-for-visit codes decoded with official NCHS labels; missing vitals are median-imputed inside each training fold. Cohort medians and dataset extents are summarized in the supplementary cohort table (repository artifact </w:t>
+        <w:t xml:space="preserve"> The National Hospital Ambulatory Medical Care Survey 2019 emergency department file [1] is a US public-domain, de-identified survey. Restricting to records with a valid recorded triage level yields 13,595 analysis encounters from 19,481 raw records, with high-acuity prevalence 0.152. The target label marks encounters recorded as emergent or urgent (nurse-assigned registration acuity, the escalation-worthy class under the platform's routing policy). Features are age, sex, six vital signs (temperature, pulse, respiratory rate, systolic and diastolic pressure, oxygen saturation), pain scale, and dummy indicators for the 20 most frequent reason-for-visit codes decoded with official NCHS labels; missing vitals are median-imputed inside each training fold. Cohort medians and dataset extents are summarized in the supplementary cohort table (repository artifact </w:t>
       </w:r>
       <w:r>
         <w:rPr>
@@ -381,7 +365,7 @@
         <w:spacing w:after="160"/>
       </w:pPr>
       <w:r>
-        <w:t>Two models are trained under a shared 5-fold stratified protocol (seed 42): a class-weighted logistic regression with standardization (the baseline) and a class-weighted XGBoost [6] (</w:t>
+        <w:t>Six candidate pipelines are trained under a shared 5-fold stratified protocol (seed 42): a class-weighted logistic regression with standardization (the baseline), class-weighted and unweighted XGBoost [6] (</w:t>
       </w:r>
       <w:r>
         <w:rPr>
@@ -399,7 +383,7 @@
         <w:t>scale_pos_weight</w:t>
       </w:r>
       <w:r>
-        <w:t xml:space="preserve"> computed from training folds), both behind a median imputer using scikit-learn [8]. Under-triage is defined as 1-recall on the high-acuity class.</w:t>
+        <w:t xml:space="preserve"> computed from training folds), and the unweighted booster wrapped in isotonic or Platt calibration, all behind a median imputer using scikit-learn [8]. The primary model is fixed by a pre-declared rule: lowest 5-fold out-of-fold Brier among the calibrated candidates, ties broken toward isotonic — which selects unweighted XGBoost + isotonic (Brier 0.1128 versus 0.1135 for Platt). Calibration and unweighting both matter: the class-weighted predecessor distorts probabilities (Brier 0.165) and reaches only 0.732 AUC versus 0.742. Under-triage is defined as 1-recall on the high-acuity class.</w:t>
       </w:r>
     </w:p>
     <w:p>
@@ -407,7 +391,7 @@
         <w:spacing w:after="160"/>
       </w:pPr>
       <w:r>
-        <w:t>Rather than accept the default 0.5 threshold, we select the operating point from the out-of-fold probability sweep as the lowest threshold whose recall reaches at least 0.80, tie-broken by precision; this yields t=0.25 for XGBoost. A physician-abstention band routes any case with maximum class probability below 0.60 to human review regardless of threshold. Threshold tuning moves the model along its ROC curve; it does not change AUC.</w:t>
+        <w:t>Rather than accept the default 0.5 threshold, we select the operating point from the out-of-fold probability sweep as the threshold with maximum precision among those whose recall reaches at least 0.80, ties broken toward the higher threshold; this yields t=0.11 for the pooled sweep. Because selecting on the same folds flatters the result, we also report a nested cross-fitted estimate: each outer fold re-selects its threshold on the other four folds only, giving thresholds 0.09–0.1. A physician-abstention band routes any case whose maximum class probability falls below 0.60 (i.e., calibrated high-acuity probability in (0.4, 0.6)) to human review regardless of threshold; the band bounds indecision near the decision boundary, not confident errors far below it. Threshold tuning moves the model along its ROC curve; it does not change AUC.</w:t>
       </w:r>
     </w:p>
     <w:p>
@@ -418,7 +402,7 @@
         <w:rPr>
           <w:b/>
         </w:rPr>
-        <w:t>Table I. Triage model comparison, 5-fold cross-validation (t=0.5, seed 42).</w:t>
+        <w:t>Table I. Triage model comparison, 5-fold cross-validation (t=0.5, seed 42), with out-of-fold Brier scores. The constant row predicts each training fold's prevalence; it is the Brier reference the calibrated primary model must beat.</w:t>
       </w:r>
     </w:p>
     <w:tbl>
@@ -428,18 +412,19 @@
         <w:tblLook w:firstColumn="1" w:firstRow="1" w:lastColumn="0" w:lastRow="0" w:noHBand="0" w:noVBand="1" w:val="04A0"/>
       </w:tblPr>
       <w:tblGrid>
-        <w:gridCol w:w="1440"/>
-        <w:gridCol w:w="1440"/>
-        <w:gridCol w:w="1440"/>
-        <w:gridCol w:w="1440"/>
-        <w:gridCol w:w="1440"/>
-        <w:gridCol w:w="1440"/>
-        <w:gridCol w:w="1440"/>
+        <w:gridCol w:w="1260"/>
+        <w:gridCol w:w="1260"/>
+        <w:gridCol w:w="1260"/>
+        <w:gridCol w:w="1260"/>
+        <w:gridCol w:w="1260"/>
+        <w:gridCol w:w="1260"/>
+        <w:gridCol w:w="1260"/>
+        <w:gridCol w:w="1260"/>
       </w:tblGrid>
       <w:tr>
         <w:tc>
           <w:tcPr>
-            <w:tcW w:type="dxa" w:w="1440"/>
+            <w:tcW w:type="dxa" w:w="1260"/>
           </w:tcPr>
           <w:p>
             <w:r>
@@ -452,7 +437,7 @@
         </w:tc>
         <w:tc>
           <w:tcPr>
-            <w:tcW w:type="dxa" w:w="1440"/>
+            <w:tcW w:type="dxa" w:w="1260"/>
           </w:tcPr>
           <w:p>
             <w:r>
@@ -465,7 +450,7 @@
         </w:tc>
         <w:tc>
           <w:tcPr>
-            <w:tcW w:type="dxa" w:w="1440"/>
+            <w:tcW w:type="dxa" w:w="1260"/>
           </w:tcPr>
           <w:p>
             <w:r>
@@ -478,7 +463,7 @@
         </w:tc>
         <w:tc>
           <w:tcPr>
-            <w:tcW w:type="dxa" w:w="1440"/>
+            <w:tcW w:type="dxa" w:w="1260"/>
           </w:tcPr>
           <w:p>
             <w:r>
@@ -491,7 +476,7 @@
         </w:tc>
         <w:tc>
           <w:tcPr>
-            <w:tcW w:type="dxa" w:w="1440"/>
+            <w:tcW w:type="dxa" w:w="1260"/>
           </w:tcPr>
           <w:p>
             <w:r>
@@ -504,7 +489,7 @@
         </w:tc>
         <w:tc>
           <w:tcPr>
-            <w:tcW w:type="dxa" w:w="1440"/>
+            <w:tcW w:type="dxa" w:w="1260"/>
           </w:tcPr>
           <w:p>
             <w:r>
@@ -517,7 +502,20 @@
         </w:tc>
         <w:tc>
           <w:tcPr>
-            <w:tcW w:type="dxa" w:w="1440"/>
+            <w:tcW w:type="dxa" w:w="1260"/>
+          </w:tcPr>
+          <w:p>
+            <w:r>
+              <w:rPr>
+                <w:b/>
+              </w:rPr>
+              <w:t>Brier</w:t>
+            </w:r>
+          </w:p>
+        </w:tc>
+        <w:tc>
+          <w:tcPr>
+            <w:tcW w:type="dxa" w:w="1260"/>
           </w:tcPr>
           <w:p>
             <w:r>
@@ -532,7 +530,7 @@
       <w:tr>
         <w:tc>
           <w:tcPr>
-            <w:tcW w:type="dxa" w:w="1440"/>
+            <w:tcW w:type="dxa" w:w="1260"/>
           </w:tcPr>
           <w:p>
             <w:r>
@@ -542,7 +540,7 @@
         </w:tc>
         <w:tc>
           <w:tcPr>
-            <w:tcW w:type="dxa" w:w="1440"/>
+            <w:tcW w:type="dxa" w:w="1260"/>
           </w:tcPr>
           <w:p>
             <w:r>
@@ -552,7 +550,7 @@
         </w:tc>
         <w:tc>
           <w:tcPr>
-            <w:tcW w:type="dxa" w:w="1440"/>
+            <w:tcW w:type="dxa" w:w="1260"/>
           </w:tcPr>
           <w:p>
             <w:r>
@@ -562,7 +560,7 @@
         </w:tc>
         <w:tc>
           <w:tcPr>
-            <w:tcW w:type="dxa" w:w="1440"/>
+            <w:tcW w:type="dxa" w:w="1260"/>
           </w:tcPr>
           <w:p>
             <w:r>
@@ -572,7 +570,7 @@
         </w:tc>
         <w:tc>
           <w:tcPr>
-            <w:tcW w:type="dxa" w:w="1440"/>
+            <w:tcW w:type="dxa" w:w="1260"/>
           </w:tcPr>
           <w:p>
             <w:r>
@@ -582,7 +580,7 @@
         </w:tc>
         <w:tc>
           <w:tcPr>
-            <w:tcW w:type="dxa" w:w="1440"/>
+            <w:tcW w:type="dxa" w:w="1260"/>
           </w:tcPr>
           <w:p>
             <w:r>
@@ -592,7 +590,17 @@
         </w:tc>
         <w:tc>
           <w:tcPr>
-            <w:tcW w:type="dxa" w:w="1440"/>
+            <w:tcW w:type="dxa" w:w="1260"/>
+          </w:tcPr>
+          <w:p>
+            <w:r>
+              <w:t>0.209</w:t>
+            </w:r>
+          </w:p>
+        </w:tc>
+        <w:tc>
+          <w:tcPr>
+            <w:tcW w:type="dxa" w:w="1260"/>
           </w:tcPr>
           <w:p>
             <w:r>
@@ -604,7 +612,7 @@
       <w:tr>
         <w:tc>
           <w:tcPr>
-            <w:tcW w:type="dxa" w:w="1440"/>
+            <w:tcW w:type="dxa" w:w="1260"/>
           </w:tcPr>
           <w:p>
             <w:r>
@@ -614,7 +622,7 @@
         </w:tc>
         <w:tc>
           <w:tcPr>
-            <w:tcW w:type="dxa" w:w="1440"/>
+            <w:tcW w:type="dxa" w:w="1260"/>
           </w:tcPr>
           <w:p>
             <w:r>
@@ -624,7 +632,7 @@
         </w:tc>
         <w:tc>
           <w:tcPr>
-            <w:tcW w:type="dxa" w:w="1440"/>
+            <w:tcW w:type="dxa" w:w="1260"/>
           </w:tcPr>
           <w:p>
             <w:r>
@@ -634,7 +642,7 @@
         </w:tc>
         <w:tc>
           <w:tcPr>
-            <w:tcW w:type="dxa" w:w="1440"/>
+            <w:tcW w:type="dxa" w:w="1260"/>
           </w:tcPr>
           <w:p>
             <w:r>
@@ -644,7 +652,7 @@
         </w:tc>
         <w:tc>
           <w:tcPr>
-            <w:tcW w:type="dxa" w:w="1440"/>
+            <w:tcW w:type="dxa" w:w="1260"/>
           </w:tcPr>
           <w:p>
             <w:r>
@@ -654,7 +662,7 @@
         </w:tc>
         <w:tc>
           <w:tcPr>
-            <w:tcW w:type="dxa" w:w="1440"/>
+            <w:tcW w:type="dxa" w:w="1260"/>
           </w:tcPr>
           <w:p>
             <w:r>
@@ -664,7 +672,345 @@
         </w:tc>
         <w:tc>
           <w:tcPr>
-            <w:tcW w:type="dxa" w:w="1440"/>
+            <w:tcW w:type="dxa" w:w="1260"/>
+          </w:tcPr>
+          <w:p>
+            <w:r>
+              <w:t>0.165</w:t>
+            </w:r>
+          </w:p>
+        </w:tc>
+        <w:tc>
+          <w:tcPr>
+            <w:tcW w:type="dxa" w:w="1260"/>
+          </w:tcPr>
+          <w:p>
+            <w:r>
+              <w:t>CDC NHAMCS 2019 ED</w:t>
+            </w:r>
+          </w:p>
+        </w:tc>
+      </w:tr>
+      <w:tr>
+        <w:tc>
+          <w:tcPr>
+            <w:tcW w:type="dxa" w:w="1260"/>
+          </w:tcPr>
+          <w:p>
+            <w:r>
+              <w:t>XGBoost (unweighted)</w:t>
+            </w:r>
+          </w:p>
+        </w:tc>
+        <w:tc>
+          <w:tcPr>
+            <w:tcW w:type="dxa" w:w="1260"/>
+          </w:tcPr>
+          <w:p>
+            <w:r>
+              <w:t>0.743</w:t>
+            </w:r>
+          </w:p>
+        </w:tc>
+        <w:tc>
+          <w:tcPr>
+            <w:tcW w:type="dxa" w:w="1260"/>
+          </w:tcPr>
+          <w:p>
+            <w:r>
+              <w:t>0.188</w:t>
+            </w:r>
+          </w:p>
+        </w:tc>
+        <w:tc>
+          <w:tcPr>
+            <w:tcW w:type="dxa" w:w="1260"/>
+          </w:tcPr>
+          <w:p>
+            <w:r>
+              <w:t>0.571</w:t>
+            </w:r>
+          </w:p>
+        </w:tc>
+        <w:tc>
+          <w:tcPr>
+            <w:tcW w:type="dxa" w:w="1260"/>
+          </w:tcPr>
+          <w:p>
+            <w:r>
+              <w:t>0.283</w:t>
+            </w:r>
+          </w:p>
+        </w:tc>
+        <w:tc>
+          <w:tcPr>
+            <w:tcW w:type="dxa" w:w="1260"/>
+          </w:tcPr>
+          <w:p>
+            <w:r>
+              <w:t>0.812</w:t>
+            </w:r>
+          </w:p>
+        </w:tc>
+        <w:tc>
+          <w:tcPr>
+            <w:tcW w:type="dxa" w:w="1260"/>
+          </w:tcPr>
+          <w:p>
+            <w:r>
+              <w:t>0.113</w:t>
+            </w:r>
+          </w:p>
+        </w:tc>
+        <w:tc>
+          <w:tcPr>
+            <w:tcW w:type="dxa" w:w="1260"/>
+          </w:tcPr>
+          <w:p>
+            <w:r>
+              <w:t>CDC NHAMCS 2019 ED</w:t>
+            </w:r>
+          </w:p>
+        </w:tc>
+      </w:tr>
+      <w:tr>
+        <w:tc>
+          <w:tcPr>
+            <w:tcW w:type="dxa" w:w="1260"/>
+          </w:tcPr>
+          <w:p>
+            <w:r>
+              <w:t>XGBoost (unweighted + isotonic)</w:t>
+            </w:r>
+          </w:p>
+        </w:tc>
+        <w:tc>
+          <w:tcPr>
+            <w:tcW w:type="dxa" w:w="1260"/>
+          </w:tcPr>
+          <w:p>
+            <w:r>
+              <w:t>0.742</w:t>
+            </w:r>
+          </w:p>
+        </w:tc>
+        <w:tc>
+          <w:tcPr>
+            <w:tcW w:type="dxa" w:w="1260"/>
+          </w:tcPr>
+          <w:p>
+            <w:r>
+              <w:t>0.141</w:t>
+            </w:r>
+          </w:p>
+        </w:tc>
+        <w:tc>
+          <w:tcPr>
+            <w:tcW w:type="dxa" w:w="1260"/>
+          </w:tcPr>
+          <w:p>
+            <w:r>
+              <w:t>0.606</w:t>
+            </w:r>
+          </w:p>
+        </w:tc>
+        <w:tc>
+          <w:tcPr>
+            <w:tcW w:type="dxa" w:w="1260"/>
+          </w:tcPr>
+          <w:p>
+            <w:r>
+              <w:t>0.227</w:t>
+            </w:r>
+          </w:p>
+        </w:tc>
+        <w:tc>
+          <w:tcPr>
+            <w:tcW w:type="dxa" w:w="1260"/>
+          </w:tcPr>
+          <w:p>
+            <w:r>
+              <w:t>0.859</w:t>
+            </w:r>
+          </w:p>
+        </w:tc>
+        <w:tc>
+          <w:tcPr>
+            <w:tcW w:type="dxa" w:w="1260"/>
+          </w:tcPr>
+          <w:p>
+            <w:r>
+              <w:t>0.113</w:t>
+            </w:r>
+          </w:p>
+        </w:tc>
+        <w:tc>
+          <w:tcPr>
+            <w:tcW w:type="dxa" w:w="1260"/>
+          </w:tcPr>
+          <w:p>
+            <w:r>
+              <w:t>CDC NHAMCS 2019 ED</w:t>
+            </w:r>
+          </w:p>
+        </w:tc>
+      </w:tr>
+      <w:tr>
+        <w:tc>
+          <w:tcPr>
+            <w:tcW w:type="dxa" w:w="1260"/>
+          </w:tcPr>
+          <w:p>
+            <w:r>
+              <w:t>XGBoost (unweighted + Platt)</w:t>
+            </w:r>
+          </w:p>
+        </w:tc>
+        <w:tc>
+          <w:tcPr>
+            <w:tcW w:type="dxa" w:w="1260"/>
+          </w:tcPr>
+          <w:p>
+            <w:r>
+              <w:t>0.743</w:t>
+            </w:r>
+          </w:p>
+        </w:tc>
+        <w:tc>
+          <w:tcPr>
+            <w:tcW w:type="dxa" w:w="1260"/>
+          </w:tcPr>
+          <w:p>
+            <w:r>
+              <w:t>0.158</w:t>
+            </w:r>
+          </w:p>
+        </w:tc>
+        <w:tc>
+          <w:tcPr>
+            <w:tcW w:type="dxa" w:w="1260"/>
+          </w:tcPr>
+          <w:p>
+            <w:r>
+              <w:t>0.593</w:t>
+            </w:r>
+          </w:p>
+        </w:tc>
+        <w:tc>
+          <w:tcPr>
+            <w:tcW w:type="dxa" w:w="1260"/>
+          </w:tcPr>
+          <w:p>
+            <w:r>
+              <w:t>0.249</w:t>
+            </w:r>
+          </w:p>
+        </w:tc>
+        <w:tc>
+          <w:tcPr>
+            <w:tcW w:type="dxa" w:w="1260"/>
+          </w:tcPr>
+          <w:p>
+            <w:r>
+              <w:t>0.842</w:t>
+            </w:r>
+          </w:p>
+        </w:tc>
+        <w:tc>
+          <w:tcPr>
+            <w:tcW w:type="dxa" w:w="1260"/>
+          </w:tcPr>
+          <w:p>
+            <w:r>
+              <w:t>0.113</w:t>
+            </w:r>
+          </w:p>
+        </w:tc>
+        <w:tc>
+          <w:tcPr>
+            <w:tcW w:type="dxa" w:w="1260"/>
+          </w:tcPr>
+          <w:p>
+            <w:r>
+              <w:t>CDC NHAMCS 2019 ED</w:t>
+            </w:r>
+          </w:p>
+        </w:tc>
+      </w:tr>
+      <w:tr>
+        <w:tc>
+          <w:tcPr>
+            <w:tcW w:type="dxa" w:w="1260"/>
+          </w:tcPr>
+          <w:p>
+            <w:r>
+              <w:t>Constant (train prevalence)</w:t>
+            </w:r>
+          </w:p>
+        </w:tc>
+        <w:tc>
+          <w:tcPr>
+            <w:tcW w:type="dxa" w:w="1260"/>
+          </w:tcPr>
+          <w:p>
+            <w:r>
+              <w:t>0.5</w:t>
+            </w:r>
+          </w:p>
+        </w:tc>
+        <w:tc>
+          <w:tcPr>
+            <w:tcW w:type="dxa" w:w="1260"/>
+          </w:tcPr>
+          <w:p>
+            <w:r>
+              <w:t>0.0</w:t>
+            </w:r>
+          </w:p>
+        </w:tc>
+        <w:tc>
+          <w:tcPr>
+            <w:tcW w:type="dxa" w:w="1260"/>
+          </w:tcPr>
+          <w:p>
+            <w:r>
+              <w:t>0.0</w:t>
+            </w:r>
+          </w:p>
+        </w:tc>
+        <w:tc>
+          <w:tcPr>
+            <w:tcW w:type="dxa" w:w="1260"/>
+          </w:tcPr>
+          <w:p>
+            <w:r>
+              <w:t>0.0</w:t>
+            </w:r>
+          </w:p>
+        </w:tc>
+        <w:tc>
+          <w:tcPr>
+            <w:tcW w:type="dxa" w:w="1260"/>
+          </w:tcPr>
+          <w:p>
+            <w:r>
+              <w:t>1.0</w:t>
+            </w:r>
+          </w:p>
+        </w:tc>
+        <w:tc>
+          <w:tcPr>
+            <w:tcW w:type="dxa" w:w="1260"/>
+          </w:tcPr>
+          <w:p>
+            <w:r>
+              <w:t>0.129</w:t>
+            </w:r>
+          </w:p>
+        </w:tc>
+        <w:tc>
+          <w:tcPr>
+            <w:tcW w:type="dxa" w:w="1260"/>
           </w:tcPr>
           <w:p>
             <w:r>
@@ -702,7 +1048,16 @@
         <w:spacing w:after="160"/>
       </w:pPr>
       <w:r>
-        <w:t>To target a sensitivity level with a finite-sample statement, we wrap the trained classifier in split-conformal calibration [9, 10]: each replicate draws stratified 60/20/20 train/calibration/test splits; on the calibration set the decision threshold is set to the ⌊α(n+1)⌋-th smallest predicted probability among positives at error level α=0.15, i.e. a nominal recall of 1-α=0.85. We repeat over 200 random seeds (0–199) and report the distribution of test recall, the implied thresholds, and abstention rates. The protocol uses train-fold statistics only. As a clinical reference we also evaluate NEWS2 [4, 5] computed from the vitals columns alone.</w:t>
+        <w:t xml:space="preserve">To target a sensitivity level with a finite-sample statement, we wrap the trained classifier in split-conformal calibration [9, 10]: each replicate draws stratified 60/20/20 train/calibration/test splits; on the calibration set the decision threshold is set from the predicted probabilities of the positive class at error level α=0.15, i.e. a nominal recall of 1-α=0.85. The textbook choice takes the ⌊α(n+1)⌋-th order statistic, whose guarantee is </w:t>
+      </w:r>
+      <w:r>
+        <w:rPr>
+          <w:i/>
+        </w:rPr>
+        <w:t>marginal</w:t>
+      </w:r>
+      <w:r>
+        <w:t>: it constrains the average over calibration draws, not the share of individual splits that miss the target. We therefore also report a PAC (probably approximately correct) variant that picks the largest rank k for which the Beta(n{+}1{-}k,\,k) CDF at 1-α is at most δ=0.1: a lower rank lowers the threshold and raises recall, buying a bound in which at most 10% of splits fall below target. We repeat over 200 random seeds (0–199) under both rules and report the distribution of test recall, the implied thresholds, and abstention rates. The protocol uses train-fold statistics only. As a clinical reference we also evaluate NEWS2 [4, 5] computed from the vitals columns alone.</w:t>
       </w:r>
     </w:p>
     <w:p>
@@ -718,7 +1073,7 @@
         <w:spacing w:after="160"/>
       </w:pPr>
       <w:r>
-        <w:t xml:space="preserve">District-week counts are converted to weekly features and fed to an IsolationForest with contamination 0.05, which fixes the alert budget at 5% of district-weeks by construction; we never present that fraction as a detected-outbreak rate. Two variants (single-week flags and confirmation-filtered flags) are compared against a rolling 4-week z-score baseline [8]. Because no gold labels exist, evaluation is </w:t>
+        <w:t xml:space="preserve">District-week counts are converted to weekly features and fed to an IsolationForest with contamination 0.05, which fixes the alert budget at 5% of district-weeks by construction; we never present that fraction as a detected-outbreak rate. Two variants (single-week flags and confirmation-filtered flags) are compared against a rolling 4-week z-score baseline. Because no gold labels exist, evaluation is </w:t>
       </w:r>
       <w:r>
         <w:rPr>
@@ -776,7 +1131,7 @@
         <w:spacing w:after="160"/>
       </w:pPr>
       <w:r>
-        <w:t xml:space="preserve">Table I compares the two learners at the default threshold. XGBoost leads on AUC (0.732 vs 0.719) and precision, but at t=0.5 it misses 0.487 of high-acuity patients, an unacceptable operating point for triage. Fig. 2 shows the ROC curves with the default, tuned, and conformal operating points marked: the entire useful operating region lies well below t=0.5. SHAP attributions (supplementary figure, repository artifact </w:t>
+        <w:t xml:space="preserve">Table I compares the candidates at the default threshold, with out-of-fold Brier as the calibration view: the primary calibrated model reaches 0.113 against 0.129 for a constant predictor (the reference it must beat), while the class-weighted variant sits at 0.165. On discrimination the primary reaches AUC 0.742 (95% CI 0.728–0.751) versus 0.719 (0.708–0.731) for logistic regression, and the paired bootstrap difference interval 0.012–0.031 excludes zero. At t=0.5, however, it misses 0.859 of high-acuity patients — an unacceptable operating point for triage despite a low false-positive rate of only 0.016. Fig. 2 shows the ROC curves with the default, tuned, and conformal operating points marked: the entire useful operating region lies well below t=0.5. SHAP attributions (supplementary figure, repository artifact </w:t>
       </w:r>
       <w:r>
         <w:rPr>
@@ -836,7 +1191,7 @@
           <w:i/>
           <w:sz w:val="18"/>
         </w:rPr>
-        <w:t>Triage ROC under 5-fold cross-validation (13,595 analysis encounters): curves for both learners, chance diagonal, and marked default, tuned, and seed-42 conformal operating points. The legend reports each curve's AUC. Data: CDC NHAMCS 2019 ED.</w:t>
+        <w:t>Triage ROC under 5-fold cross-validation (13,595 analysis encounters): curves for the candidate models, chance diagonal, and marked default, tuned, and seed-42 conformal operating points. The legend reports each curve's AUC. Data: CDC NHAMCS 2019 ED.</w:t>
       </w:r>
     </w:p>
     <w:p>
@@ -852,7 +1207,7 @@
         <w:spacing w:after="160"/>
       </w:pPr>
       <w:r>
-        <w:t>Table II and Fig. 3 show the central triage result: lowering the threshold from 0.50 to 0.25 cuts under-triage from 48.7% to 15.5% (recall 0.845) at the cost of precision (0.207) and abstention 0.235; over-triage rises correspondingly. This is the standard sensitivity-first trade of emergency triage, reported on both axes so the exchange is visible. The abstention band keeps 0.235 of cases with the model deferring to a physician, which bounds the blast radius of the precision drop.</w:t>
+        <w:t>Table II and Fig. 3 show the central triage result. On the pooled sweep, lowering the threshold from 0.50 to 0.11 cuts under-triage from 85.9% to 20.0% (recall 0.8, FPR 0.493) at the cost of precision (0.226) and abstention 0.042. The nested cross-fitted estimate — the conservative one to quote, since each outer fold tunes without seeing its own test labels — puts recall at 0.829, precision 0.214, FPR 0.545 and under-triage 17.2% across thresholds 0.09–0.1, confirming the trade survives out-of-fold tuning. This is the standard sensitivity-first trade of emergency triage, reported on both axes so the exchange is visible. The abstention band defers 0.042 of cases to a physician, bounding model indecision near the boundary — it does not bound the false-high risk of confidently low predictions below the band.</w:t>
       </w:r>
     </w:p>
     <w:p>
@@ -862,7 +1217,7 @@
       <w:r>
         <w:drawing>
           <wp:inline xmlns:a="http://schemas.openxmlformats.org/drawingml/2006/main" xmlns:pic="http://schemas.openxmlformats.org/drawingml/2006/picture">
-            <wp:extent cx="5486400" cy="2109955"/>
+            <wp:extent cx="5486400" cy="2110948"/>
             <wp:docPr id="3" name="Picture 3"/>
             <wp:cNvGraphicFramePr>
               <a:graphicFrameLocks noChangeAspect="1"/>
@@ -883,7 +1238,7 @@
                   <pic:spPr>
                     <a:xfrm>
                       <a:off x="0" y="0"/>
-                      <a:ext cx="5486400" cy="2109955"/>
+                      <a:ext cx="5486400" cy="2110948"/>
                     </a:xfrm>
                     <a:prstGeom prst="rect"/>
                   </pic:spPr>
@@ -903,7 +1258,7 @@
           <w:i/>
           <w:sz w:val="18"/>
         </w:rPr>
-        <w:t>Out-of-fold threshold trade-offs (recall, precision, under- and over-triage, abstention) with the pre-declared selections t=0.25 (XGBoost). Data: CDC NHAMCS 2019 ED.</w:t>
+        <w:t>Out-of-fold threshold trade-offs (recall, precision, FPR, under- and over-triage, abstention) with the pre-declared selections t=0.11 (pooled sweep) and the nested range 0.09–0.1. Data: CDC NHAMCS 2019 ED.</w:t>
       </w:r>
     </w:p>
     <w:p>
@@ -914,7 +1269,7 @@
         <w:rPr>
           <w:b/>
         </w:rPr>
-        <w:t>Table II. Operating points for the triage module: default, tuned (pre-declared recall ≥ 0.80 rule) and split-conformal (seed 42).</w:t>
+        <w:t>Table II. Operating points for the triage module: default, tuned (pre-declared rule: max precision among thresholds with OOF recall ≥ 0.80), the nested cross-fitted evaluation, and split-conformal (seed 42).</w:t>
       </w:r>
     </w:p>
     <w:tbl>
@@ -924,19 +1279,20 @@
         <w:tblLook w:firstColumn="1" w:firstRow="1" w:lastColumn="0" w:lastRow="0" w:noHBand="0" w:noVBand="1" w:val="04A0"/>
       </w:tblPr>
       <w:tblGrid>
-        <w:gridCol w:w="1260"/>
-        <w:gridCol w:w="1260"/>
-        <w:gridCol w:w="1260"/>
-        <w:gridCol w:w="1260"/>
-        <w:gridCol w:w="1260"/>
-        <w:gridCol w:w="1260"/>
-        <w:gridCol w:w="1260"/>
-        <w:gridCol w:w="1260"/>
+        <w:gridCol w:w="1120"/>
+        <w:gridCol w:w="1120"/>
+        <w:gridCol w:w="1120"/>
+        <w:gridCol w:w="1120"/>
+        <w:gridCol w:w="1120"/>
+        <w:gridCol w:w="1120"/>
+        <w:gridCol w:w="1120"/>
+        <w:gridCol w:w="1120"/>
+        <w:gridCol w:w="1120"/>
       </w:tblGrid>
       <w:tr>
         <w:tc>
           <w:tcPr>
-            <w:tcW w:type="dxa" w:w="1260"/>
+            <w:tcW w:type="dxa" w:w="1120"/>
           </w:tcPr>
           <w:p>
             <w:r>
@@ -949,7 +1305,7 @@
         </w:tc>
         <w:tc>
           <w:tcPr>
-            <w:tcW w:type="dxa" w:w="1260"/>
+            <w:tcW w:type="dxa" w:w="1120"/>
           </w:tcPr>
           <w:p>
             <w:r>
@@ -962,7 +1318,7 @@
         </w:tc>
         <w:tc>
           <w:tcPr>
-            <w:tcW w:type="dxa" w:w="1260"/>
+            <w:tcW w:type="dxa" w:w="1120"/>
           </w:tcPr>
           <w:p>
             <w:r>
@@ -975,7 +1331,7 @@
         </w:tc>
         <w:tc>
           <w:tcPr>
-            <w:tcW w:type="dxa" w:w="1260"/>
+            <w:tcW w:type="dxa" w:w="1120"/>
           </w:tcPr>
           <w:p>
             <w:r>
@@ -988,7 +1344,20 @@
         </w:tc>
         <w:tc>
           <w:tcPr>
-            <w:tcW w:type="dxa" w:w="1260"/>
+            <w:tcW w:type="dxa" w:w="1120"/>
+          </w:tcPr>
+          <w:p>
+            <w:r>
+              <w:rPr>
+                <w:b/>
+              </w:rPr>
+              <w:t>FPR</w:t>
+            </w:r>
+          </w:p>
+        </w:tc>
+        <w:tc>
+          <w:tcPr>
+            <w:tcW w:type="dxa" w:w="1120"/>
           </w:tcPr>
           <w:p>
             <w:r>
@@ -1001,7 +1370,7 @@
         </w:tc>
         <w:tc>
           <w:tcPr>
-            <w:tcW w:type="dxa" w:w="1260"/>
+            <w:tcW w:type="dxa" w:w="1120"/>
           </w:tcPr>
           <w:p>
             <w:r>
@@ -1014,7 +1383,7 @@
         </w:tc>
         <w:tc>
           <w:tcPr>
-            <w:tcW w:type="dxa" w:w="1260"/>
+            <w:tcW w:type="dxa" w:w="1120"/>
           </w:tcPr>
           <w:p>
             <w:r>
@@ -1027,7 +1396,7 @@
         </w:tc>
         <w:tc>
           <w:tcPr>
-            <w:tcW w:type="dxa" w:w="1260"/>
+            <w:tcW w:type="dxa" w:w="1120"/>
           </w:tcPr>
           <w:p>
             <w:r>
@@ -1042,17 +1411,17 @@
       <w:tr>
         <w:tc>
           <w:tcPr>
-            <w:tcW w:type="dxa" w:w="1260"/>
+            <w:tcW w:type="dxa" w:w="1120"/>
           </w:tcPr>
           <w:p>
             <w:r>
-              <w:t>XGBoost, t=0.50 (OOF)</w:t>
+              <w:t>Primary, t=0.50 (pooled OOF)</w:t>
             </w:r>
           </w:p>
         </w:tc>
         <w:tc>
           <w:tcPr>
-            <w:tcW w:type="dxa" w:w="1260"/>
+            <w:tcW w:type="dxa" w:w="1120"/>
           </w:tcPr>
           <w:p>
             <w:r>
@@ -1062,57 +1431,67 @@
         </w:tc>
         <w:tc>
           <w:tcPr>
-            <w:tcW w:type="dxa" w:w="1260"/>
+            <w:tcW w:type="dxa" w:w="1120"/>
           </w:tcPr>
           <w:p>
             <w:r>
-              <w:t>0.513</w:t>
+              <w:t>0.141</w:t>
             </w:r>
           </w:p>
         </w:tc>
         <w:tc>
           <w:tcPr>
-            <w:tcW w:type="dxa" w:w="1260"/>
+            <w:tcW w:type="dxa" w:w="1120"/>
           </w:tcPr>
           <w:p>
             <w:r>
-              <w:t>0.334</w:t>
+              <w:t>0.605</w:t>
             </w:r>
           </w:p>
         </w:tc>
         <w:tc>
           <w:tcPr>
-            <w:tcW w:type="dxa" w:w="1260"/>
+            <w:tcW w:type="dxa" w:w="1120"/>
           </w:tcPr>
           <w:p>
             <w:r>
-              <w:t>0.487</w:t>
+              <w:t>0.016</w:t>
             </w:r>
           </w:p>
         </w:tc>
         <w:tc>
           <w:tcPr>
-            <w:tcW w:type="dxa" w:w="1260"/>
+            <w:tcW w:type="dxa" w:w="1120"/>
           </w:tcPr>
           <w:p>
             <w:r>
-              <w:t>0.235</w:t>
+              <w:t>0.859</w:t>
             </w:r>
           </w:p>
         </w:tc>
         <w:tc>
           <w:tcPr>
-            <w:tcW w:type="dxa" w:w="1260"/>
+            <w:tcW w:type="dxa" w:w="1120"/>
           </w:tcPr>
           <w:p>
             <w:r>
-              <w:t>0.732</w:t>
+              <w:t>0.042</w:t>
             </w:r>
           </w:p>
         </w:tc>
         <w:tc>
           <w:tcPr>
-            <w:tcW w:type="dxa" w:w="1260"/>
+            <w:tcW w:type="dxa" w:w="1120"/>
+          </w:tcPr>
+          <w:p>
+            <w:r>
+              <w:t>0.74</w:t>
+            </w:r>
+          </w:p>
+        </w:tc>
+        <w:tc>
+          <w:tcPr>
+            <w:tcW w:type="dxa" w:w="1120"/>
           </w:tcPr>
           <w:p>
             <w:r>
@@ -1124,77 +1503,87 @@
       <w:tr>
         <w:tc>
           <w:tcPr>
-            <w:tcW w:type="dxa" w:w="1260"/>
+            <w:tcW w:type="dxa" w:w="1120"/>
           </w:tcPr>
           <w:p>
             <w:r>
-              <w:t>XGBoost, t=0.25 tuned (OOF)</w:t>
+              <w:t>Primary, tuned (pooled OOF)</w:t>
             </w:r>
           </w:p>
         </w:tc>
         <w:tc>
           <w:tcPr>
-            <w:tcW w:type="dxa" w:w="1260"/>
+            <w:tcW w:type="dxa" w:w="1120"/>
           </w:tcPr>
           <w:p>
             <w:r>
-              <w:t>0.25</w:t>
+              <w:t>0.11</w:t>
             </w:r>
           </w:p>
         </w:tc>
         <w:tc>
           <w:tcPr>
-            <w:tcW w:type="dxa" w:w="1260"/>
+            <w:tcW w:type="dxa" w:w="1120"/>
           </w:tcPr>
           <w:p>
             <w:r>
-              <w:t>0.845</w:t>
+              <w:t>0.8</w:t>
             </w:r>
           </w:p>
         </w:tc>
         <w:tc>
           <w:tcPr>
-            <w:tcW w:type="dxa" w:w="1260"/>
+            <w:tcW w:type="dxa" w:w="1120"/>
           </w:tcPr>
           <w:p>
             <w:r>
-              <w:t>0.207</w:t>
+              <w:t>0.226</w:t>
             </w:r>
           </w:p>
         </w:tc>
         <w:tc>
           <w:tcPr>
-            <w:tcW w:type="dxa" w:w="1260"/>
+            <w:tcW w:type="dxa" w:w="1120"/>
           </w:tcPr>
           <w:p>
             <w:r>
-              <w:t>0.155</w:t>
+              <w:t>0.493</w:t>
             </w:r>
           </w:p>
         </w:tc>
         <w:tc>
           <w:tcPr>
-            <w:tcW w:type="dxa" w:w="1260"/>
+            <w:tcW w:type="dxa" w:w="1120"/>
           </w:tcPr>
           <w:p>
             <w:r>
-              <w:t>0.235</w:t>
+              <w:t>0.2</w:t>
             </w:r>
           </w:p>
         </w:tc>
         <w:tc>
           <w:tcPr>
-            <w:tcW w:type="dxa" w:w="1260"/>
+            <w:tcW w:type="dxa" w:w="1120"/>
           </w:tcPr>
           <w:p>
             <w:r>
-              <w:t>0.732</w:t>
+              <w:t>0.042</w:t>
             </w:r>
           </w:p>
         </w:tc>
         <w:tc>
           <w:tcPr>
-            <w:tcW w:type="dxa" w:w="1260"/>
+            <w:tcW w:type="dxa" w:w="1120"/>
+          </w:tcPr>
+          <w:p>
+            <w:r>
+              <w:t>0.74</w:t>
+            </w:r>
+          </w:p>
+        </w:tc>
+        <w:tc>
+          <w:tcPr>
+            <w:tcW w:type="dxa" w:w="1120"/>
           </w:tcPr>
           <w:p>
             <w:r>
@@ -1206,37 +1595,37 @@
       <w:tr>
         <w:tc>
           <w:tcPr>
-            <w:tcW w:type="dxa" w:w="1260"/>
+            <w:tcW w:type="dxa" w:w="1120"/>
           </w:tcPr>
           <w:p>
             <w:r>
-              <w:t>LogReg, t=0.40 tuned (OOF)</w:t>
+              <w:t>Primary, cross-fitted (headline)</w:t>
             </w:r>
           </w:p>
         </w:tc>
         <w:tc>
           <w:tcPr>
-            <w:tcW w:type="dxa" w:w="1260"/>
+            <w:tcW w:type="dxa" w:w="1120"/>
           </w:tcPr>
           <w:p>
             <w:r>
-              <w:t>0.4</w:t>
+              <w:t>0.096 [0.09, 0.10]</w:t>
             </w:r>
           </w:p>
         </w:tc>
         <w:tc>
           <w:tcPr>
-            <w:tcW w:type="dxa" w:w="1260"/>
+            <w:tcW w:type="dxa" w:w="1120"/>
           </w:tcPr>
           <w:p>
             <w:r>
-              <w:t>0.811</w:t>
+              <w:t>0.829</w:t>
             </w:r>
           </w:p>
         </w:tc>
         <w:tc>
           <w:tcPr>
-            <w:tcW w:type="dxa" w:w="1260"/>
+            <w:tcW w:type="dxa" w:w="1120"/>
           </w:tcPr>
           <w:p>
             <w:r>
@@ -1246,37 +1635,47 @@
         </w:tc>
         <w:tc>
           <w:tcPr>
-            <w:tcW w:type="dxa" w:w="1260"/>
+            <w:tcW w:type="dxa" w:w="1120"/>
           </w:tcPr>
           <w:p>
             <w:r>
-              <w:t>0.189</w:t>
+              <w:t>0.545</w:t>
             </w:r>
           </w:p>
         </w:tc>
         <w:tc>
           <w:tcPr>
-            <w:tcW w:type="dxa" w:w="1260"/>
+            <w:tcW w:type="dxa" w:w="1120"/>
           </w:tcPr>
           <w:p>
             <w:r>
-              <w:t>0.394</w:t>
+              <w:t>0.172</w:t>
             </w:r>
           </w:p>
         </w:tc>
         <w:tc>
           <w:tcPr>
-            <w:tcW w:type="dxa" w:w="1260"/>
+            <w:tcW w:type="dxa" w:w="1120"/>
           </w:tcPr>
           <w:p>
             <w:r>
-              <w:t>0.719</w:t>
+              <w:t>0.042</w:t>
             </w:r>
           </w:p>
         </w:tc>
         <w:tc>
           <w:tcPr>
-            <w:tcW w:type="dxa" w:w="1260"/>
+            <w:tcW w:type="dxa" w:w="1120"/>
+          </w:tcPr>
+          <w:p>
+            <w:r>
+              <w:t>0.74</w:t>
+            </w:r>
+          </w:p>
+        </w:tc>
+        <w:tc>
+          <w:tcPr>
+            <w:tcW w:type="dxa" w:w="1120"/>
           </w:tcPr>
           <w:p>
             <w:r>
@@ -1288,77 +1687,179 @@
       <w:tr>
         <w:tc>
           <w:tcPr>
-            <w:tcW w:type="dxa" w:w="1260"/>
+            <w:tcW w:type="dxa" w:w="1120"/>
           </w:tcPr>
           <w:p>
             <w:r>
-              <w:t>XGBoost, conformal, seed-42 test</w:t>
+              <w:t>LogReg, tuned (pooled OOF)</w:t>
             </w:r>
           </w:p>
         </w:tc>
         <w:tc>
           <w:tcPr>
-            <w:tcW w:type="dxa" w:w="1260"/>
+            <w:tcW w:type="dxa" w:w="1120"/>
           </w:tcPr>
           <w:p>
             <w:r>
-              <w:t>0.173</w:t>
+              <w:t>0.4</w:t>
             </w:r>
           </w:p>
         </w:tc>
         <w:tc>
           <w:tcPr>
-            <w:tcW w:type="dxa" w:w="1260"/>
+            <w:tcW w:type="dxa" w:w="1120"/>
           </w:tcPr>
           <w:p>
             <w:r>
-              <w:t>0.913</w:t>
+              <w:t>0.811</w:t>
             </w:r>
           </w:p>
         </w:tc>
         <w:tc>
           <w:tcPr>
-            <w:tcW w:type="dxa" w:w="1260"/>
+            <w:tcW w:type="dxa" w:w="1120"/>
           </w:tcPr>
           <w:p>
             <w:r>
-              <w:t>0.187</w:t>
+              <w:t>0.214</w:t>
             </w:r>
           </w:p>
         </w:tc>
         <w:tc>
           <w:tcPr>
-            <w:tcW w:type="dxa" w:w="1260"/>
+            <w:tcW w:type="dxa" w:w="1120"/>
           </w:tcPr>
           <w:p>
             <w:r>
-              <w:t>0.087</w:t>
+              <w:t>0.536</w:t>
             </w:r>
           </w:p>
         </w:tc>
         <w:tc>
           <w:tcPr>
-            <w:tcW w:type="dxa" w:w="1260"/>
+            <w:tcW w:type="dxa" w:w="1120"/>
           </w:tcPr>
           <w:p>
             <w:r>
-              <w:t>0.231</w:t>
+              <w:t>0.189</w:t>
             </w:r>
           </w:p>
         </w:tc>
         <w:tc>
           <w:tcPr>
-            <w:tcW w:type="dxa" w:w="1260"/>
+            <w:tcW w:type="dxa" w:w="1120"/>
           </w:tcPr>
           <w:p>
             <w:r>
-              <w:t>0.739</w:t>
+              <w:t>0.394</w:t>
             </w:r>
           </w:p>
         </w:tc>
         <w:tc>
           <w:tcPr>
-            <w:tcW w:type="dxa" w:w="1260"/>
+            <w:tcW w:type="dxa" w:w="1120"/>
+          </w:tcPr>
+          <w:p>
+            <w:r>
+              <w:t>0.719</w:t>
+            </w:r>
+          </w:p>
+        </w:tc>
+        <w:tc>
+          <w:tcPr>
+            <w:tcW w:type="dxa" w:w="1120"/>
+          </w:tcPr>
+          <w:p>
+            <w:r>
+              <w:t>CDC NHAMCS 2019 ED</w:t>
+            </w:r>
+          </w:p>
+        </w:tc>
+      </w:tr>
+      <w:tr>
+        <w:tc>
+          <w:tcPr>
+            <w:tcW w:type="dxa" w:w="1120"/>
+          </w:tcPr>
+          <w:p>
+            <w:r>
+              <w:t>Primary, conformal, seed-42 test</w:t>
+            </w:r>
+          </w:p>
+        </w:tc>
+        <w:tc>
+          <w:tcPr>
+            <w:tcW w:type="dxa" w:w="1120"/>
+          </w:tcPr>
+          <w:p>
+            <w:r>
+              <w:t>0.099</w:t>
+            </w:r>
+          </w:p>
+        </w:tc>
+        <w:tc>
+          <w:tcPr>
+            <w:tcW w:type="dxa" w:w="1120"/>
+          </w:tcPr>
+          <w:p>
+            <w:r>
+              <w:t>0.886</w:t>
+            </w:r>
+          </w:p>
+        </w:tc>
+        <w:tc>
+          <w:tcPr>
+            <w:tcW w:type="dxa" w:w="1120"/>
+          </w:tcPr>
+          <w:p>
+            <w:r>
+              <w:t>0.199</w:t>
+            </w:r>
+          </w:p>
+        </w:tc>
+        <w:tc>
+          <w:tcPr>
+            <w:tcW w:type="dxa" w:w="1120"/>
+          </w:tcPr>
+          <w:p>
+            <w:r>
+              <w:t>0.643</w:t>
+            </w:r>
+          </w:p>
+        </w:tc>
+        <w:tc>
+          <w:tcPr>
+            <w:tcW w:type="dxa" w:w="1120"/>
+          </w:tcPr>
+          <w:p>
+            <w:r>
+              <w:t>0.114</w:t>
+            </w:r>
+          </w:p>
+        </w:tc>
+        <w:tc>
+          <w:tcPr>
+            <w:tcW w:type="dxa" w:w="1120"/>
+          </w:tcPr>
+          <w:p>
+            <w:r>
+              <w:t>0.036</w:t>
+            </w:r>
+          </w:p>
+        </w:tc>
+        <w:tc>
+          <w:tcPr>
+            <w:tcW w:type="dxa" w:w="1120"/>
+          </w:tcPr>
+          <w:p>
+            <w:r>
+              <w:t>0.755</w:t>
+            </w:r>
+          </w:p>
+        </w:tc>
+        <w:tc>
+          <w:tcPr>
+            <w:tcW w:type="dxa" w:w="1120"/>
           </w:tcPr>
           <w:p>
             <w:r>
@@ -1380,7 +1881,7 @@
         <w:t>Data source:</w:t>
       </w:r>
       <w:r>
-        <w:t xml:space="preserve"> CDC NHAMCS 2019 ED (n=13,595). AUC is threshold-independent (5-fold CV); OOF = out-of-fold.</w:t>
+        <w:t xml:space="preserve"> CDC NHAMCS 2019 ED (n=13,595). AUC is threshold-independent; OOF = out-of-fold; cross-fitted rows tune on inner folds and evaluate on held-out outer folds.</w:t>
       </w:r>
     </w:p>
     <w:p>
@@ -1396,7 +1897,7 @@
         <w:spacing w:after="160"/>
       </w:pPr>
       <w:r>
-        <w:t>Table III sweeps the conformal error level over 200 splits per setting. At α=0.15 the mean test recall is 0.850 (SD 0.027), yet 46% of the splits miss the 0.85 mark (Fig. 4); the finite-sample statement is marginal over calibration draws, not a per-deployment promise, and we state it that way. Mean implied thresholds (0.212) and abstention (0.218) are stable across seeds.</w:t>
+        <w:t>Table III sweeps the conformal error level over 200 splits per setting under both rules. At α=0.15 the marginal rule reaches mean test recall 0.884 (SD 0.033) at mean precision 0.196, yet 12.5% of the splits miss the 0.85 mark (Fig. 4); the finite-sample statement is marginal over calibration draws, not a per-deployment promise, and we state it that way. The PAC rule at δ=0.1 changes the accounting: mean recall rises to 0.900 (SD 0.030) and only 3.5% of splits fall below target — within the δ budget — at mean precision 0.191 and mean threshold 0.089 (versus 0.094 for the marginal rule). The cost is a lower threshold and hence more flags; mean abstention (0.043) is stable across seeds.</w:t>
       </w:r>
     </w:p>
     <w:p>
@@ -1406,7 +1907,7 @@
       <w:r>
         <w:drawing>
           <wp:inline xmlns:a="http://schemas.openxmlformats.org/drawingml/2006/main" xmlns:pic="http://schemas.openxmlformats.org/drawingml/2006/picture">
-            <wp:extent cx="5486400" cy="4086903"/>
+            <wp:extent cx="5486400" cy="4691192"/>
             <wp:docPr id="4" name="Picture 4"/>
             <wp:cNvGraphicFramePr>
               <a:graphicFrameLocks noChangeAspect="1"/>
@@ -1427,7 +1928,7 @@
                   <pic:spPr>
                     <a:xfrm>
                       <a:off x="0" y="0"/>
-                      <a:ext cx="5486400" cy="4086903"/>
+                      <a:ext cx="5486400" cy="4691192"/>
                     </a:xfrm>
                     <a:prstGeom prst="rect"/>
                   </pic:spPr>
@@ -1447,7 +1948,7 @@
           <w:i/>
           <w:sz w:val="18"/>
         </w:rPr>
-        <w:t>Split-conformal test recall per split over 200 random splits; the dashed line marks the nominal sensitivity target and the solid line the split mean. The guarantee is marginal, not per-split. Data: CDC NHAMCS 2019 ED.</w:t>
+        <w:t>Split-conformal test recall per split over 200 random splits under the marginal and PAC rules; the dashed line marks the nominal sensitivity target and solid lines the rule means. The marginal rule is not a per-split guarantee; PAC bounds the below-target share at δ. Data: CDC NHAMCS 2019 ED.</w:t>
       </w:r>
     </w:p>
     <w:p>
@@ -1458,7 +1959,7 @@
         <w:rPr>
           <w:b/>
         </w:rPr>
-        <w:t>Table III. Split-conformal recall control over 200 random 60/20/20 splits (XGBoost, calibration quantile on positives). The guarantee is marginal: individual splits vary.</w:t>
+        <w:t>Table III. Split-conformal recall control over 200 random 60/20/20 splits (primary XGBoost+isotonic; calibration quantile on positives). Marginal: textbook k=⌊α(n+1)⌋ rule, average guarantee. PAC: Beta order-statistic rank at δ=0.1, bounding the below-target share per split.</w:t>
       </w:r>
     </w:p>
     <w:tbl>
@@ -1468,19 +1969,18 @@
         <w:tblLook w:firstColumn="1" w:firstRow="1" w:lastColumn="0" w:lastRow="0" w:noHBand="0" w:noVBand="1" w:val="04A0"/>
       </w:tblPr>
       <w:tblGrid>
-        <w:gridCol w:w="1260"/>
-        <w:gridCol w:w="1260"/>
-        <w:gridCol w:w="1260"/>
-        <w:gridCol w:w="1260"/>
-        <w:gridCol w:w="1260"/>
-        <w:gridCol w:w="1260"/>
-        <w:gridCol w:w="1260"/>
-        <w:gridCol w:w="1260"/>
+        <w:gridCol w:w="1440"/>
+        <w:gridCol w:w="1440"/>
+        <w:gridCol w:w="1440"/>
+        <w:gridCol w:w="1440"/>
+        <w:gridCol w:w="1440"/>
+        <w:gridCol w:w="1440"/>
+        <w:gridCol w:w="1440"/>
       </w:tblGrid>
       <w:tr>
         <w:tc>
           <w:tcPr>
-            <w:tcW w:type="dxa" w:w="1260"/>
+            <w:tcW w:type="dxa" w:w="1440"/>
           </w:tcPr>
           <w:p>
             <w:r>
@@ -1493,7 +1993,20 @@
         </w:tc>
         <w:tc>
           <w:tcPr>
-            <w:tcW w:type="dxa" w:w="1260"/>
+            <w:tcW w:type="dxa" w:w="1440"/>
+          </w:tcPr>
+          <w:p>
+            <w:r>
+              <w:rPr>
+                <w:b/>
+              </w:rPr>
+              <w:t>Rule</w:t>
+            </w:r>
+          </w:p>
+        </w:tc>
+        <w:tc>
+          <w:tcPr>
+            <w:tcW w:type="dxa" w:w="1440"/>
           </w:tcPr>
           <w:p>
             <w:r>
@@ -1506,7 +2019,7 @@
         </w:tc>
         <w:tc>
           <w:tcPr>
-            <w:tcW w:type="dxa" w:w="1260"/>
+            <w:tcW w:type="dxa" w:w="1440"/>
           </w:tcPr>
           <w:p>
             <w:r>
@@ -1519,46 +2032,20 @@
         </w:tc>
         <w:tc>
           <w:tcPr>
-            <w:tcW w:type="dxa" w:w="1260"/>
+            <w:tcW w:type="dxa" w:w="1440"/>
           </w:tcPr>
           <w:p>
             <w:r>
               <w:rPr>
                 <w:b/>
               </w:rPr>
-              <w:t>Min</w:t>
+              <w:t>Frac. below 1-α</w:t>
             </w:r>
           </w:p>
         </w:tc>
         <w:tc>
           <w:tcPr>
-            <w:tcW w:type="dxa" w:w="1260"/>
-          </w:tcPr>
-          <w:p>
-            <w:r>
-              <w:rPr>
-                <w:b/>
-              </w:rPr>
-              <w:t>Max</w:t>
-            </w:r>
-          </w:p>
-        </w:tc>
-        <w:tc>
-          <w:tcPr>
-            <w:tcW w:type="dxa" w:w="1260"/>
-          </w:tcPr>
-          <w:p>
-            <w:r>
-              <w:rPr>
-                <w:b/>
-              </w:rPr>
-              <w:t>Frac. splits 0.85</w:t>
-            </w:r>
-          </w:p>
-        </w:tc>
-        <w:tc>
-          <w:tcPr>
-            <w:tcW w:type="dxa" w:w="1260"/>
+            <w:tcW w:type="dxa" w:w="1440"/>
           </w:tcPr>
           <w:p>
             <w:r>
@@ -1571,7 +2058,7 @@
         </w:tc>
         <w:tc>
           <w:tcPr>
-            <w:tcW w:type="dxa" w:w="1260"/>
+            <w:tcW w:type="dxa" w:w="1440"/>
           </w:tcPr>
           <w:p>
             <w:r>
@@ -1586,7 +2073,7 @@
       <w:tr>
         <w:tc>
           <w:tcPr>
-            <w:tcW w:type="dxa" w:w="1260"/>
+            <w:tcW w:type="dxa" w:w="1440"/>
           </w:tcPr>
           <w:p>
             <w:r>
@@ -1596,17 +2083,27 @@
         </w:tc>
         <w:tc>
           <w:tcPr>
-            <w:tcW w:type="dxa" w:w="1260"/>
+            <w:tcW w:type="dxa" w:w="1440"/>
           </w:tcPr>
           <w:p>
             <w:r>
-              <w:t>0.953</w:t>
+              <w:t>marginal</w:t>
             </w:r>
           </w:p>
         </w:tc>
         <w:tc>
           <w:tcPr>
-            <w:tcW w:type="dxa" w:w="1260"/>
+            <w:tcW w:type="dxa" w:w="1440"/>
+          </w:tcPr>
+          <w:p>
+            <w:r>
+              <w:t>0.966</w:t>
+            </w:r>
+          </w:p>
+        </w:tc>
+        <w:tc>
+          <w:tcPr>
+            <w:tcW w:type="dxa" w:w="1440"/>
           </w:tcPr>
           <w:p>
             <w:r>
@@ -1616,47 +2113,27 @@
         </w:tc>
         <w:tc>
           <w:tcPr>
-            <w:tcW w:type="dxa" w:w="1260"/>
+            <w:tcW w:type="dxa" w:w="1440"/>
           </w:tcPr>
           <w:p>
             <w:r>
-              <w:t>0.911</w:t>
+              <w:t>0.145</w:t>
             </w:r>
           </w:p>
         </w:tc>
         <w:tc>
           <w:tcPr>
-            <w:tcW w:type="dxa" w:w="1260"/>
+            <w:tcW w:type="dxa" w:w="1440"/>
           </w:tcPr>
           <w:p>
             <w:r>
-              <w:t>0.983</w:t>
+              <w:t>0.169</w:t>
             </w:r>
           </w:p>
         </w:tc>
         <w:tc>
           <w:tcPr>
-            <w:tcW w:type="dxa" w:w="1260"/>
-          </w:tcPr>
-          <w:p>
-            <w:r>
-              <w:t>0.0</w:t>
-            </w:r>
-          </w:p>
-        </w:tc>
-        <w:tc>
-          <w:tcPr>
-            <w:tcW w:type="dxa" w:w="1260"/>
-          </w:tcPr>
-          <w:p>
-            <w:r>
-              <w:t>0.171</w:t>
-            </w:r>
-          </w:p>
-        </w:tc>
-        <w:tc>
-          <w:tcPr>
-            <w:tcW w:type="dxa" w:w="1260"/>
+            <w:tcW w:type="dxa" w:w="1440"/>
           </w:tcPr>
           <w:p>
             <w:r>
@@ -1668,77 +2145,67 @@
       <w:tr>
         <w:tc>
           <w:tcPr>
-            <w:tcW w:type="dxa" w:w="1260"/>
+            <w:tcW w:type="dxa" w:w="1440"/>
           </w:tcPr>
           <w:p>
             <w:r>
-              <w:t>0.1</w:t>
+              <w:t>0.05</w:t>
             </w:r>
           </w:p>
         </w:tc>
         <w:tc>
           <w:tcPr>
-            <w:tcW w:type="dxa" w:w="1260"/>
+            <w:tcW w:type="dxa" w:w="1440"/>
           </w:tcPr>
           <w:p>
             <w:r>
-              <w:t>0.902</w:t>
+              <w:t>PAC (δ=0.1)</w:t>
             </w:r>
           </w:p>
         </w:tc>
         <w:tc>
           <w:tcPr>
-            <w:tcW w:type="dxa" w:w="1260"/>
+            <w:tcW w:type="dxa" w:w="1440"/>
           </w:tcPr>
           <w:p>
             <w:r>
-              <w:t>0.02</w:t>
+              <w:t>0.976</w:t>
             </w:r>
           </w:p>
         </w:tc>
         <w:tc>
           <w:tcPr>
-            <w:tcW w:type="dxa" w:w="1260"/>
+            <w:tcW w:type="dxa" w:w="1440"/>
           </w:tcPr>
           <w:p>
             <w:r>
-              <w:t>0.841</w:t>
+              <w:t>0.013</w:t>
             </w:r>
           </w:p>
         </w:tc>
         <w:tc>
           <w:tcPr>
-            <w:tcW w:type="dxa" w:w="1260"/>
+            <w:tcW w:type="dxa" w:w="1440"/>
           </w:tcPr>
           <w:p>
             <w:r>
-              <w:t>0.954</w:t>
+              <w:t>0.03</w:t>
             </w:r>
           </w:p>
         </w:tc>
         <w:tc>
           <w:tcPr>
-            <w:tcW w:type="dxa" w:w="1260"/>
+            <w:tcW w:type="dxa" w:w="1440"/>
           </w:tcPr>
           <w:p>
             <w:r>
-              <w:t>0.005</w:t>
+              <w:t>0.164</w:t>
             </w:r>
           </w:p>
         </w:tc>
         <w:tc>
           <w:tcPr>
-            <w:tcW w:type="dxa" w:w="1260"/>
-          </w:tcPr>
-          <w:p>
-            <w:r>
-              <w:t>0.185</w:t>
-            </w:r>
-          </w:p>
-        </w:tc>
-        <w:tc>
-          <w:tcPr>
-            <w:tcW w:type="dxa" w:w="1260"/>
+            <w:tcW w:type="dxa" w:w="1440"/>
           </w:tcPr>
           <w:p>
             <w:r>
@@ -1750,77 +2217,67 @@
       <w:tr>
         <w:tc>
           <w:tcPr>
-            <w:tcW w:type="dxa" w:w="1260"/>
+            <w:tcW w:type="dxa" w:w="1440"/>
           </w:tcPr>
           <w:p>
             <w:r>
-              <w:t>0.15</w:t>
+              <w:t>0.1</w:t>
             </w:r>
           </w:p>
         </w:tc>
         <w:tc>
           <w:tcPr>
-            <w:tcW w:type="dxa" w:w="1260"/>
+            <w:tcW w:type="dxa" w:w="1440"/>
           </w:tcPr>
           <w:p>
             <w:r>
-              <w:t>0.85</w:t>
+              <w:t>marginal</w:t>
             </w:r>
           </w:p>
         </w:tc>
         <w:tc>
           <w:tcPr>
-            <w:tcW w:type="dxa" w:w="1260"/>
+            <w:tcW w:type="dxa" w:w="1440"/>
           </w:tcPr>
           <w:p>
             <w:r>
-              <w:t>0.027</w:t>
+              <w:t>0.924</w:t>
             </w:r>
           </w:p>
         </w:tc>
         <w:tc>
           <w:tcPr>
-            <w:tcW w:type="dxa" w:w="1260"/>
+            <w:tcW w:type="dxa" w:w="1440"/>
           </w:tcPr>
           <w:p>
             <w:r>
-              <w:t>0.773</w:t>
+              <w:t>0.023</w:t>
             </w:r>
           </w:p>
         </w:tc>
         <w:tc>
           <w:tcPr>
-            <w:tcW w:type="dxa" w:w="1260"/>
+            <w:tcW w:type="dxa" w:w="1440"/>
           </w:tcPr>
           <w:p>
             <w:r>
-              <w:t>0.92</w:t>
+              <w:t>0.155</w:t>
             </w:r>
           </w:p>
         </w:tc>
         <w:tc>
           <w:tcPr>
-            <w:tcW w:type="dxa" w:w="1260"/>
+            <w:tcW w:type="dxa" w:w="1440"/>
           </w:tcPr>
           <w:p>
             <w:r>
-              <w:t>0.46</w:t>
+              <w:t>0.183</w:t>
             </w:r>
           </w:p>
         </w:tc>
         <w:tc>
           <w:tcPr>
-            <w:tcW w:type="dxa" w:w="1260"/>
-          </w:tcPr>
-          <w:p>
-            <w:r>
-              <w:t>0.198</w:t>
-            </w:r>
-          </w:p>
-        </w:tc>
-        <w:tc>
-          <w:tcPr>
-            <w:tcW w:type="dxa" w:w="1260"/>
+            <w:tcW w:type="dxa" w:w="1440"/>
           </w:tcPr>
           <w:p>
             <w:r>
@@ -1832,77 +2289,67 @@
       <w:tr>
         <w:tc>
           <w:tcPr>
-            <w:tcW w:type="dxa" w:w="1260"/>
+            <w:tcW w:type="dxa" w:w="1440"/>
           </w:tcPr>
           <w:p>
             <w:r>
-              <w:t>0.2</w:t>
+              <w:t>0.1</w:t>
             </w:r>
           </w:p>
         </w:tc>
         <w:tc>
           <w:tcPr>
-            <w:tcW w:type="dxa" w:w="1260"/>
+            <w:tcW w:type="dxa" w:w="1440"/>
           </w:tcPr>
           <w:p>
             <w:r>
-              <w:t>0.8</w:t>
+              <w:t>PAC (δ=0.1)</w:t>
             </w:r>
           </w:p>
         </w:tc>
         <w:tc>
           <w:tcPr>
-            <w:tcW w:type="dxa" w:w="1260"/>
+            <w:tcW w:type="dxa" w:w="1440"/>
           </w:tcPr>
           <w:p>
             <w:r>
-              <w:t>0.029</w:t>
+              <w:t>0.938</w:t>
             </w:r>
           </w:p>
         </w:tc>
         <w:tc>
           <w:tcPr>
-            <w:tcW w:type="dxa" w:w="1260"/>
+            <w:tcW w:type="dxa" w:w="1440"/>
           </w:tcPr>
           <w:p>
             <w:r>
-              <w:t>0.729</w:t>
+              <w:t>0.021</w:t>
             </w:r>
           </w:p>
         </w:tc>
         <w:tc>
           <w:tcPr>
-            <w:tcW w:type="dxa" w:w="1260"/>
+            <w:tcW w:type="dxa" w:w="1440"/>
           </w:tcPr>
           <w:p>
             <w:r>
-              <w:t>0.877</w:t>
+              <w:t>0.03</w:t>
             </w:r>
           </w:p>
         </w:tc>
         <w:tc>
           <w:tcPr>
-            <w:tcW w:type="dxa" w:w="1260"/>
+            <w:tcW w:type="dxa" w:w="1440"/>
           </w:tcPr>
           <w:p>
             <w:r>
-              <w:t>0.97</w:t>
+              <w:t>0.179</w:t>
             </w:r>
           </w:p>
         </w:tc>
         <w:tc>
           <w:tcPr>
-            <w:tcW w:type="dxa" w:w="1260"/>
-          </w:tcPr>
-          <w:p>
-            <w:r>
-              <w:t>0.211</w:t>
-            </w:r>
-          </w:p>
-        </w:tc>
-        <w:tc>
-          <w:tcPr>
-            <w:tcW w:type="dxa" w:w="1260"/>
+            <w:tcW w:type="dxa" w:w="1440"/>
           </w:tcPr>
           <w:p>
             <w:r>
@@ -1914,7 +2361,295 @@
       <w:tr>
         <w:tc>
           <w:tcPr>
-            <w:tcW w:type="dxa" w:w="1260"/>
+            <w:tcW w:type="dxa" w:w="1440"/>
+          </w:tcPr>
+          <w:p>
+            <w:r>
+              <w:t>0.15</w:t>
+            </w:r>
+          </w:p>
+        </w:tc>
+        <w:tc>
+          <w:tcPr>
+            <w:tcW w:type="dxa" w:w="1440"/>
+          </w:tcPr>
+          <w:p>
+            <w:r>
+              <w:t>marginal</w:t>
+            </w:r>
+          </w:p>
+        </w:tc>
+        <w:tc>
+          <w:tcPr>
+            <w:tcW w:type="dxa" w:w="1440"/>
+          </w:tcPr>
+          <w:p>
+            <w:r>
+              <w:t>0.884</w:t>
+            </w:r>
+          </w:p>
+        </w:tc>
+        <w:tc>
+          <w:tcPr>
+            <w:tcW w:type="dxa" w:w="1440"/>
+          </w:tcPr>
+          <w:p>
+            <w:r>
+              <w:t>0.033</w:t>
+            </w:r>
+          </w:p>
+        </w:tc>
+        <w:tc>
+          <w:tcPr>
+            <w:tcW w:type="dxa" w:w="1440"/>
+          </w:tcPr>
+          <w:p>
+            <w:r>
+              <w:t>0.125</w:t>
+            </w:r>
+          </w:p>
+        </w:tc>
+        <w:tc>
+          <w:tcPr>
+            <w:tcW w:type="dxa" w:w="1440"/>
+          </w:tcPr>
+          <w:p>
+            <w:r>
+              <w:t>0.196</w:t>
+            </w:r>
+          </w:p>
+        </w:tc>
+        <w:tc>
+          <w:tcPr>
+            <w:tcW w:type="dxa" w:w="1440"/>
+          </w:tcPr>
+          <w:p>
+            <w:r>
+              <w:t>CDC NHAMCS 2019 ED (n=13,595)</w:t>
+            </w:r>
+          </w:p>
+        </w:tc>
+      </w:tr>
+      <w:tr>
+        <w:tc>
+          <w:tcPr>
+            <w:tcW w:type="dxa" w:w="1440"/>
+          </w:tcPr>
+          <w:p>
+            <w:r>
+              <w:t>0.15</w:t>
+            </w:r>
+          </w:p>
+        </w:tc>
+        <w:tc>
+          <w:tcPr>
+            <w:tcW w:type="dxa" w:w="1440"/>
+          </w:tcPr>
+          <w:p>
+            <w:r>
+              <w:t>PAC (δ=0.1)</w:t>
+            </w:r>
+          </w:p>
+        </w:tc>
+        <w:tc>
+          <w:tcPr>
+            <w:tcW w:type="dxa" w:w="1440"/>
+          </w:tcPr>
+          <w:p>
+            <w:r>
+              <w:t>0.9</w:t>
+            </w:r>
+          </w:p>
+        </w:tc>
+        <w:tc>
+          <w:tcPr>
+            <w:tcW w:type="dxa" w:w="1440"/>
+          </w:tcPr>
+          <w:p>
+            <w:r>
+              <w:t>0.03</w:t>
+            </w:r>
+          </w:p>
+        </w:tc>
+        <w:tc>
+          <w:tcPr>
+            <w:tcW w:type="dxa" w:w="1440"/>
+          </w:tcPr>
+          <w:p>
+            <w:r>
+              <w:t>0.035</w:t>
+            </w:r>
+          </w:p>
+        </w:tc>
+        <w:tc>
+          <w:tcPr>
+            <w:tcW w:type="dxa" w:w="1440"/>
+          </w:tcPr>
+          <w:p>
+            <w:r>
+              <w:t>0.191</w:t>
+            </w:r>
+          </w:p>
+        </w:tc>
+        <w:tc>
+          <w:tcPr>
+            <w:tcW w:type="dxa" w:w="1440"/>
+          </w:tcPr>
+          <w:p>
+            <w:r>
+              <w:t>CDC NHAMCS 2019 ED (n=13,595)</w:t>
+            </w:r>
+          </w:p>
+        </w:tc>
+      </w:tr>
+      <w:tr>
+        <w:tc>
+          <w:tcPr>
+            <w:tcW w:type="dxa" w:w="1440"/>
+          </w:tcPr>
+          <w:p>
+            <w:r>
+              <w:t>0.2</w:t>
+            </w:r>
+          </w:p>
+        </w:tc>
+        <w:tc>
+          <w:tcPr>
+            <w:tcW w:type="dxa" w:w="1440"/>
+          </w:tcPr>
+          <w:p>
+            <w:r>
+              <w:t>marginal</w:t>
+            </w:r>
+          </w:p>
+        </w:tc>
+        <w:tc>
+          <w:tcPr>
+            <w:tcW w:type="dxa" w:w="1440"/>
+          </w:tcPr>
+          <w:p>
+            <w:r>
+              <w:t>0.832</w:t>
+            </w:r>
+          </w:p>
+        </w:tc>
+        <w:tc>
+          <w:tcPr>
+            <w:tcW w:type="dxa" w:w="1440"/>
+          </w:tcPr>
+          <w:p>
+            <w:r>
+              <w:t>0.038</w:t>
+            </w:r>
+          </w:p>
+        </w:tc>
+        <w:tc>
+          <w:tcPr>
+            <w:tcW w:type="dxa" w:w="1440"/>
+          </w:tcPr>
+          <w:p>
+            <w:r>
+              <w:t>0.22</w:t>
+            </w:r>
+          </w:p>
+        </w:tc>
+        <w:tc>
+          <w:tcPr>
+            <w:tcW w:type="dxa" w:w="1440"/>
+          </w:tcPr>
+          <w:p>
+            <w:r>
+              <w:t>0.212</w:t>
+            </w:r>
+          </w:p>
+        </w:tc>
+        <w:tc>
+          <w:tcPr>
+            <w:tcW w:type="dxa" w:w="1440"/>
+          </w:tcPr>
+          <w:p>
+            <w:r>
+              <w:t>CDC NHAMCS 2019 ED (n=13,595)</w:t>
+            </w:r>
+          </w:p>
+        </w:tc>
+      </w:tr>
+      <w:tr>
+        <w:tc>
+          <w:tcPr>
+            <w:tcW w:type="dxa" w:w="1440"/>
+          </w:tcPr>
+          <w:p>
+            <w:r>
+              <w:t>0.2</w:t>
+            </w:r>
+          </w:p>
+        </w:tc>
+        <w:tc>
+          <w:tcPr>
+            <w:tcW w:type="dxa" w:w="1440"/>
+          </w:tcPr>
+          <w:p>
+            <w:r>
+              <w:t>PAC (δ=0.1)</w:t>
+            </w:r>
+          </w:p>
+        </w:tc>
+        <w:tc>
+          <w:tcPr>
+            <w:tcW w:type="dxa" w:w="1440"/>
+          </w:tcPr>
+          <w:p>
+            <w:r>
+              <w:t>0.858</w:t>
+            </w:r>
+          </w:p>
+        </w:tc>
+        <w:tc>
+          <w:tcPr>
+            <w:tcW w:type="dxa" w:w="1440"/>
+          </w:tcPr>
+          <w:p>
+            <w:r>
+              <w:t>0.038</w:t>
+            </w:r>
+          </w:p>
+        </w:tc>
+        <w:tc>
+          <w:tcPr>
+            <w:tcW w:type="dxa" w:w="1440"/>
+          </w:tcPr>
+          <w:p>
+            <w:r>
+              <w:t>0.06</w:t>
+            </w:r>
+          </w:p>
+        </w:tc>
+        <w:tc>
+          <w:tcPr>
+            <w:tcW w:type="dxa" w:w="1440"/>
+          </w:tcPr>
+          <w:p>
+            <w:r>
+              <w:t>0.204</w:t>
+            </w:r>
+          </w:p>
+        </w:tc>
+        <w:tc>
+          <w:tcPr>
+            <w:tcW w:type="dxa" w:w="1440"/>
+          </w:tcPr>
+          <w:p>
+            <w:r>
+              <w:t>CDC NHAMCS 2019 ED (n=13,595)</w:t>
+            </w:r>
+          </w:p>
+        </w:tc>
+      </w:tr>
+      <w:tr>
+        <w:tc>
+          <w:tcPr>
+            <w:tcW w:type="dxa" w:w="1440"/>
           </w:tcPr>
           <w:p>
             <w:r>
@@ -1924,67 +2659,129 @@
         </w:tc>
         <w:tc>
           <w:tcPr>
-            <w:tcW w:type="dxa" w:w="1260"/>
+            <w:tcW w:type="dxa" w:w="1440"/>
           </w:tcPr>
           <w:p>
             <w:r>
-              <w:t>0.7</w:t>
+              <w:t>marginal</w:t>
             </w:r>
           </w:p>
         </w:tc>
         <w:tc>
           <w:tcPr>
-            <w:tcW w:type="dxa" w:w="1260"/>
+            <w:tcW w:type="dxa" w:w="1440"/>
           </w:tcPr>
           <w:p>
             <w:r>
-              <w:t>0.032</w:t>
+              <w:t>0.737</w:t>
             </w:r>
           </w:p>
         </w:tc>
         <w:tc>
           <w:tcPr>
-            <w:tcW w:type="dxa" w:w="1260"/>
+            <w:tcW w:type="dxa" w:w="1440"/>
           </w:tcPr>
           <w:p>
             <w:r>
-              <w:t>0.604</w:t>
+              <w:t>0.043</w:t>
             </w:r>
           </w:p>
         </w:tc>
         <w:tc>
           <w:tcPr>
-            <w:tcW w:type="dxa" w:w="1260"/>
+            <w:tcW w:type="dxa" w:w="1440"/>
           </w:tcPr>
           <w:p>
             <w:r>
-              <w:t>0.795</w:t>
+              <w:t>0.175</w:t>
             </w:r>
           </w:p>
         </w:tc>
         <w:tc>
           <w:tcPr>
-            <w:tcW w:type="dxa" w:w="1260"/>
+            <w:tcW w:type="dxa" w:w="1440"/>
           </w:tcPr>
           <w:p>
             <w:r>
-              <w:t>1.0</w:t>
+              <w:t>0.243</w:t>
             </w:r>
           </w:p>
         </w:tc>
         <w:tc>
           <w:tcPr>
-            <w:tcW w:type="dxa" w:w="1260"/>
+            <w:tcW w:type="dxa" w:w="1440"/>
           </w:tcPr>
           <w:p>
             <w:r>
-              <w:t>0.241</w:t>
+              <w:t>CDC NHAMCS 2019 ED (n=13,595)</w:t>
+            </w:r>
+          </w:p>
+        </w:tc>
+      </w:tr>
+      <w:tr>
+        <w:tc>
+          <w:tcPr>
+            <w:tcW w:type="dxa" w:w="1440"/>
+          </w:tcPr>
+          <w:p>
+            <w:r>
+              <w:t>0.3</w:t>
             </w:r>
           </w:p>
         </w:tc>
         <w:tc>
           <w:tcPr>
-            <w:tcW w:type="dxa" w:w="1260"/>
+            <w:tcW w:type="dxa" w:w="1440"/>
+          </w:tcPr>
+          <w:p>
+            <w:r>
+              <w:t>PAC (δ=0.1)</w:t>
+            </w:r>
+          </w:p>
+        </w:tc>
+        <w:tc>
+          <w:tcPr>
+            <w:tcW w:type="dxa" w:w="1440"/>
+          </w:tcPr>
+          <w:p>
+            <w:r>
+              <w:t>0.768</w:t>
+            </w:r>
+          </w:p>
+        </w:tc>
+        <w:tc>
+          <w:tcPr>
+            <w:tcW w:type="dxa" w:w="1440"/>
+          </w:tcPr>
+          <w:p>
+            <w:r>
+              <w:t>0.043</w:t>
+            </w:r>
+          </w:p>
+        </w:tc>
+        <w:tc>
+          <w:tcPr>
+            <w:tcW w:type="dxa" w:w="1440"/>
+          </w:tcPr>
+          <w:p>
+            <w:r>
+              <w:t>0.025</w:t>
+            </w:r>
+          </w:p>
+        </w:tc>
+        <w:tc>
+          <w:tcPr>
+            <w:tcW w:type="dxa" w:w="1440"/>
+          </w:tcPr>
+          <w:p>
+            <w:r>
+              <w:t>0.233</w:t>
+            </w:r>
+          </w:p>
+        </w:tc>
+        <w:tc>
+          <w:tcPr>
+            <w:tcW w:type="dxa" w:w="1440"/>
           </w:tcPr>
           <w:p>
             <w:r>
@@ -2014,7 +2811,7 @@
         <w:spacing w:after="160"/>
       </w:pPr>
       <w:r>
-        <w:t xml:space="preserve">On the seed-42 reference split the conformal selector reaches recall 0.913 (95% bootstrap CI 0.886–0.94), precision 0.187, AUC 0.739, Brier 0.158, abstention 0.231, at threshold 0.173. The vitals-only NEWS2 baseline cannot match the target on this cohort: no cutoff reaches the 0.85 recall level (cutoff ≥ 1 attains recall 0.669 at precision 0.168; the clinical cutoff ≥ 5 attains 0.138 at 0.207). The learned model therefore buys recall at comparable precision, but its reliability diagram (supplementary artifact </w:t>
+        <w:t xml:space="preserve">On the seed-42 reference split the conformal selector reaches recall 0.886 (95% bootstrap CI 0.856–0.914), precision 0.199, FPR 0.643, AUC 0.755, Brier 0.112, abstention 0.036, at threshold 0.099. The vitals-only NEWS2 baseline cannot match the target on this cohort: no cutoff reaches the 0.85 recall level (cutoff ≥ 1 attains recall 0.669 at precision 0.168; the clinical cutoff ≥ 5 attains 0.138 at 0.207). The learned model therefore buys recall at comparable precision; its reliability diagram (supplementary artifact </w:t>
       </w:r>
       <w:r>
         <w:rPr>
@@ -2023,7 +2820,7 @@
         <w:t>paper_figS1b_calibration</w:t>
       </w:r>
       <w:r>
-        <w:t>, Brier 0.158) shows overconfident probabilities: scores are rank-useful for the threshold rule and are not quoted as absolute risks.</w:t>
+        <w:t>; Brier 0.112 versus 0.129 for a constant predictor) shows isotonic calibration improving on the constant baseline — probabilities drive the threshold rule and are not quoted as absolute risks.</w:t>
       </w:r>
     </w:p>
     <w:p>
@@ -2039,7 +2836,7 @@
         <w:spacing w:after="160"/>
       </w:pPr>
       <w:r>
-        <w:t>Table IV and Fig. 5 compare detectors descriptively. Single-week IsolationForest flags hit rate 0.25 inside the Delta window versus 0.036 outside — the largest concentration of any method — with district coverage 0.398 and median lead 2 weeks over a background flag rate of 0.024. Requiring a confirmation week halves the background to 0.013 but costs a week of lead; the z-score baseline leads earliest and covers the widest share of districts, at roughly four times the background flag rate of single-week isolation flags (0.093). None of these numbers is a precision or recall: without district-level outbreak labels, honest claims stop at enrichment.</w:t>
+        <w:t>Table IV and Fig. 5 compare detectors descriptively. Single-week IsolationForest flags hit rate 0.25 inside the Delta window versus 0.036 outside — the largest concentration of any method — with district coverage 0.398 and median lead 2 weeks over a background flag rate of 0.024. Requiring a confirmation week halves the background to 0.013 but costs a week of lead; the z-score baseline leads earliest and covers the widest share of districts, at roughly four times the background flag rate of single-week isolation flags (0.093). None of these numbers is a precision or recall: without district-level outbreak labels, claims stop at enrichment.</w:t>
       </w:r>
     </w:p>
     <w:p>
@@ -2682,7 +3479,7 @@
         <w:t>paper_TS1_forecast</w:t>
       </w:r>
       <w:r>
-        <w:t>). The honest reading is that classical baselines remain competitive on short monthly series; this module supports logistics, not clinical claims, and is excluded from the main findings (supplementary figures in the repository).</w:t>
+        <w:t>). The reading is that classical baselines remain competitive on short monthly series; this module supports logistics, not clinical claims, and is excluded from the main findings (supplementary figures in the repository).</w:t>
       </w:r>
     </w:p>
     <w:p>
@@ -2704,7 +3501,7 @@
         <w:t>What holds.</w:t>
       </w:r>
       <w:r>
-        <w:t xml:space="preserve"> On this cohort, a standard boosted model with a deliberately chosen threshold and a physician-abstention band delivers a large, auditable reduction in under-triage, and split-conformal calibration provides a workable mechanism for targeting sensitivity with a stated error level. The surveillance module shows that a label-free detector concentrates alerts in known wave windows far above background, the strongest claim the labels support.</w:t>
+        <w:t xml:space="preserve"> On this cohort, a standard boosted model with a cross-fitted, deliberately chosen threshold and a physician-abstention band delivers a large, auditable reduction in under-triage, and split-conformal calibration — especially the PAC rule — provides a workable mechanism for targeting sensitivity with a stated error level. The surveillance module shows that a label-free detector concentrates alerts in known wave windows far above background, the strongest claim the labels support.</w:t>
       </w:r>
     </w:p>
     <w:p>
@@ -2736,7 +3533,7 @@
         <w:t>Guarantee strength.</w:t>
       </w:r>
       <w:r>
-        <w:t xml:space="preserve"> The conformal guarantee is marginal: 46% of individual splits miss the target, so a single unlucky calibration split can under-deliver. </w:t>
+        <w:t xml:space="preserve"> The marginal rule's guarantee is average-case: 12.5% of individual splits miss the target, so a single unlucky calibration split can under-deliver. The PAC rule cuts this to 3.5% at δ=0.1 on these splits, but both rules rest on exchangeability of calibration draws; under shift either can miss. </w:t>
       </w:r>
       <w:r>
         <w:rPr>
@@ -2745,7 +3542,16 @@
         <w:t>Calibration.</w:t>
       </w:r>
       <w:r>
-        <w:t xml:space="preserve"> Tree probabilities are overconfident (Brier 0.158); they are used for ranking and thresholds, not as quoted risks. </w:t>
+        <w:t xml:space="preserve"> Isotonic calibration beats a constant predictor (0.113 vs 0.129) but the probabilities remain unvalidated as absolute risks; they drive thresholds, not quotations. </w:t>
+      </w:r>
+      <w:r>
+        <w:rPr>
+          <w:i/>
+        </w:rPr>
+        <w:t>Survey design.</w:t>
+      </w:r>
+      <w:r>
+        <w:t xml:space="preserve"> NHAMCS sampling weights and clustering strata are not modeled; the reported uncertainty reflects split variability, not the complex survey design. </w:t>
       </w:r>
       <w:r>
         <w:rPr>
@@ -2795,7 +3601,7 @@
         <w:spacing w:after="160"/>
       </w:pPr>
       <w:r>
-        <w:t>Pairing a threshold-tuned, abstention-guarded triage model with a label-free outbreak detector turns a telemedicine platform's raw streams into two quantified decisions: which patients escalate, and where to look next. The results are deliberately bounded—48.7% under-triage reduced to 15.5% at recall 0.845, a marginal conformal guarantee of 0.850 mean recall, and 7.0× descriptive wave enrichment—and every number is reproducible from public data with released code. Future work is prospective validation on rural-Indian intake data and calibration monitoring under drift.</w:t>
+        <w:t>Pairing a threshold-tuned, abstention-guarded triage model with a label-free outbreak detector turns a telemedicine platform's raw streams into two quantified decisions: which patients escalate, and where to look next. The results are deliberately bounded—85.9% under-triage reduced to 17.2% at recall 0.829, below-target conformal splits cut from 12.5% to 3.5% under the PAC rule with mean recall 0.900, and 7.0× descriptive wave enrichment—and every number is reproducible from public data with released code. Future work is prospective validation on rural-Indian intake data and calibration monitoring under drift.</w:t>
       </w:r>
     </w:p>
     <w:p>

</xml_diff>

<commit_message>
paper: real byline - Vaibhav Kadam, Tanvi Gandhi, Omkar Shinolikar (Bylance Technologies); rebuilt paper + deck, audit ALL PASS
</commit_message>
<xml_diff>
--- a/paper/main.docx
+++ b/paper/main.docx
@@ -18,10 +18,10 @@
         <w:rPr>
           <w:b/>
         </w:rPr>
-        <w:t>Author One, Author Two</w:t>
+        <w:t>Vaibhav Kadam, Tanvi Gandhi, Omkar Shinolikar</w:t>
       </w:r>
       <w:r>
-        <w:t xml:space="preserve"> — Placeholder Department, Placeholder Institute, City, India, {author.one, author.two}@example.com</w:t>
+        <w:t xml:space="preserve"> — Bylance Technologies, India</w:t>
       </w:r>
     </w:p>
     <w:p>

</xml_diff>